<commit_message>
updated musicTech resume and short paras
</commit_message>
<xml_diff>
--- a/Cover Letter New.docx
+++ b/Cover Letter New.docx
@@ -6,6 +6,7 @@
       <w:pPr>
         <w:pStyle w:val="Normal"/>
         <w:spacing w:before="0" w:after="0"/>
+        <w:contextualSpacing/>
         <w:jc w:val="center"/>
         <w:rPr>
           <w:b/>
@@ -29,6 +30,7 @@
       <w:pPr>
         <w:pStyle w:val="Normal"/>
         <w:spacing w:lineRule="auto" w:line="240" w:before="0" w:after="0"/>
+        <w:contextualSpacing/>
         <w:rPr>
           <w:b/>
           <w:b/>
@@ -50,6 +52,7 @@
       <w:pPr>
         <w:pStyle w:val="Normal"/>
         <w:spacing w:lineRule="auto" w:line="240" w:before="0" w:after="0"/>
+        <w:contextualSpacing/>
         <w:jc w:val="right"/>
         <w:rPr>
           <w:i/>
@@ -71,6 +74,7 @@
       <w:pPr>
         <w:pStyle w:val="Normal"/>
         <w:spacing w:lineRule="auto" w:line="240" w:before="0" w:after="0"/>
+        <w:contextualSpacing/>
         <w:jc w:val="right"/>
         <w:rPr>
           <w:i/>
@@ -95,13 +99,13 @@
     <w:p>
       <w:pPr>
         <w:pStyle w:val="Normal"/>
-        <w:keepNext w:val="false"/>
+        <w:keepNext/>
         <w:keepLines w:val="false"/>
         <w:widowControl/>
-        <w:pBdr/>
         <w:shd w:val="clear" w:fill="auto"/>
         <w:spacing w:lineRule="auto" w:line="240" w:before="0" w:after="0"/>
         <w:ind w:left="0" w:right="0" w:hanging="0"/>
+        <w:contextualSpacing/>
         <w:jc w:val="right"/>
         <w:rPr/>
       </w:pPr>
@@ -122,13 +126,13 @@
     <w:p>
       <w:pPr>
         <w:pStyle w:val="Normal"/>
-        <w:keepNext w:val="false"/>
+        <w:keepNext/>
         <w:keepLines w:val="false"/>
         <w:widowControl/>
-        <w:pBdr/>
         <w:shd w:val="clear" w:fill="auto"/>
         <w:spacing w:lineRule="auto" w:line="240" w:before="0" w:after="0"/>
         <w:ind w:left="0" w:right="0" w:hanging="0"/>
+        <w:contextualSpacing/>
         <w:jc w:val="right"/>
         <w:rPr/>
       </w:pPr>
@@ -150,6 +154,7 @@
       <w:pPr>
         <w:pStyle w:val="Normal"/>
         <w:spacing w:lineRule="auto" w:line="240" w:before="0" w:after="0"/>
+        <w:contextualSpacing/>
         <w:jc w:val="right"/>
         <w:rPr>
           <w:i/>
@@ -171,6 +176,7 @@
       <w:pPr>
         <w:pStyle w:val="Normal"/>
         <w:spacing w:lineRule="auto" w:line="240" w:before="0" w:after="0"/>
+        <w:contextualSpacing/>
         <w:jc w:val="right"/>
         <w:rPr>
           <w:b/>
@@ -195,6 +201,7 @@
       <w:pPr>
         <w:pStyle w:val="Normal"/>
         <w:spacing w:before="0" w:after="0"/>
+        <w:contextualSpacing/>
         <w:jc w:val="both"/>
         <w:rPr>
           <w:rFonts w:ascii="Times New Roman" w:hAnsi="Times New Roman" w:eastAsia="Times New Roman" w:cs="Times New Roman"/>
@@ -214,346 +221,389 @@
       <w:pPr>
         <w:pStyle w:val="Normal"/>
         <w:spacing w:before="0" w:after="0"/>
-        <w:jc w:val="both"/>
-        <w:rPr>
-          <w:rFonts w:ascii="Times New Roman" w:hAnsi="Times New Roman" w:eastAsia="Times New Roman" w:cs="Times New Roman"/>
-          <w:sz w:val="24"/>
-          <w:szCs w:val="24"/>
-        </w:rPr>
-      </w:pPr>
-      <w:r>
-        <w:rPr>
-          <w:rFonts w:eastAsia="Times New Roman" w:cs="Times New Roman" w:ascii="Times New Roman" w:hAnsi="Times New Roman"/>
-          <w:sz w:val="24"/>
-          <w:szCs w:val="24"/>
-        </w:rPr>
-        <w:t xml:space="preserve">I’m a pre-final year student at </w:t>
-      </w:r>
-      <w:r>
-        <w:rPr>
-          <w:rFonts w:eastAsia="Times New Roman" w:cs="Times New Roman" w:ascii="Times New Roman" w:hAnsi="Times New Roman"/>
-          <w:b/>
-          <w:sz w:val="24"/>
-          <w:szCs w:val="24"/>
-        </w:rPr>
-        <w:t>International Institute of Information Technology, Hyderabad</w:t>
-      </w:r>
-      <w:r>
-        <w:rPr>
-          <w:rFonts w:eastAsia="Times New Roman" w:cs="Times New Roman" w:ascii="Times New Roman" w:hAnsi="Times New Roman"/>
-          <w:sz w:val="24"/>
-          <w:szCs w:val="24"/>
-        </w:rPr>
-        <w:t xml:space="preserve">. I’m pursuing my </w:t>
-      </w:r>
-      <w:r>
-        <w:rPr>
-          <w:rFonts w:eastAsia="Times New Roman" w:cs="Times New Roman" w:ascii="Times New Roman" w:hAnsi="Times New Roman"/>
-          <w:b/>
-          <w:sz w:val="24"/>
-          <w:szCs w:val="24"/>
-        </w:rPr>
-        <w:t>B.Tech in Computer Science</w:t>
-      </w:r>
-      <w:r>
-        <w:rPr>
-          <w:rFonts w:eastAsia="Times New Roman" w:cs="Times New Roman" w:ascii="Times New Roman" w:hAnsi="Times New Roman"/>
-          <w:sz w:val="24"/>
-          <w:szCs w:val="24"/>
-        </w:rPr>
-        <w:t xml:space="preserve"> and </w:t>
-      </w:r>
-      <w:r>
-        <w:rPr>
-          <w:rFonts w:eastAsia="Times New Roman" w:cs="Times New Roman" w:ascii="Times New Roman" w:hAnsi="Times New Roman"/>
-          <w:b/>
-          <w:sz w:val="24"/>
-          <w:szCs w:val="24"/>
-        </w:rPr>
-        <w:t>MS by Research in Exact Humanities</w:t>
-      </w:r>
-      <w:r>
-        <w:rPr>
-          <w:rFonts w:eastAsia="Times New Roman" w:cs="Times New Roman" w:ascii="Times New Roman" w:hAnsi="Times New Roman"/>
-          <w:sz w:val="24"/>
-          <w:szCs w:val="24"/>
-        </w:rPr>
-        <w:t xml:space="preserve">. My primary interests lies in the field of </w:t>
-      </w:r>
-      <w:r>
-        <w:rPr>
-          <w:rFonts w:eastAsia="Times New Roman" w:cs="Times New Roman" w:ascii="Times New Roman" w:hAnsi="Times New Roman"/>
-          <w:sz w:val="24"/>
-          <w:szCs w:val="24"/>
-          <w:u w:val="single"/>
-        </w:rPr>
-        <w:t>Software Development, Data Science and Machine Learning</w:t>
-      </w:r>
-      <w:r>
-        <w:rPr>
-          <w:rFonts w:eastAsia="Times New Roman" w:cs="Times New Roman" w:ascii="Times New Roman" w:hAnsi="Times New Roman"/>
-          <w:sz w:val="24"/>
-          <w:szCs w:val="24"/>
-        </w:rPr>
-        <w:t>.</w:t>
-      </w:r>
-    </w:p>
-    <w:p>
-      <w:pPr>
-        <w:pStyle w:val="Normal"/>
-        <w:spacing w:before="0" w:after="0"/>
-        <w:jc w:val="both"/>
-        <w:rPr>
-          <w:rFonts w:ascii="Times New Roman" w:hAnsi="Times New Roman" w:eastAsia="Times New Roman" w:cs="Times New Roman"/>
-          <w:sz w:val="24"/>
-          <w:szCs w:val="24"/>
-        </w:rPr>
-      </w:pPr>
-      <w:r>
-        <w:rPr>
-          <w:rFonts w:eastAsia="Times New Roman" w:cs="Times New Roman" w:ascii="Times New Roman" w:hAnsi="Times New Roman"/>
-          <w:sz w:val="24"/>
-          <w:szCs w:val="24"/>
-        </w:rPr>
-      </w:r>
-    </w:p>
-    <w:p>
-      <w:pPr>
-        <w:pStyle w:val="Normal"/>
-        <w:spacing w:before="0" w:after="0"/>
-        <w:jc w:val="both"/>
-        <w:rPr>
-          <w:rFonts w:ascii="Times New Roman" w:hAnsi="Times New Roman" w:eastAsia="Times New Roman" w:cs="Times New Roman"/>
-          <w:sz w:val="24"/>
-          <w:szCs w:val="24"/>
-        </w:rPr>
-      </w:pPr>
-      <w:r>
-        <w:rPr>
-          <w:rFonts w:eastAsia="Times New Roman" w:cs="Times New Roman" w:ascii="Times New Roman" w:hAnsi="Times New Roman"/>
-          <w:sz w:val="24"/>
-          <w:szCs w:val="24"/>
-        </w:rPr>
-        <w:t xml:space="preserve">I am a fast learner, a passionate developing enthusiast and I love solving problems; be it tinkering with designing a model or simply developing programs and breaking the code. I have a good amount of </w:t>
-      </w:r>
-      <w:r>
-        <w:rPr>
-          <w:rFonts w:eastAsia="Times New Roman" w:cs="Times New Roman" w:ascii="Times New Roman" w:hAnsi="Times New Roman"/>
-          <w:sz w:val="24"/>
-          <w:szCs w:val="24"/>
-          <w:u w:val="single"/>
-        </w:rPr>
-        <w:t>full stack development</w:t>
-      </w:r>
-      <w:r>
-        <w:rPr>
-          <w:rFonts w:eastAsia="Times New Roman" w:cs="Times New Roman" w:ascii="Times New Roman" w:hAnsi="Times New Roman"/>
-          <w:sz w:val="24"/>
-          <w:szCs w:val="24"/>
-        </w:rPr>
-        <w:t xml:space="preserve"> and </w:t>
-      </w:r>
-      <w:r>
-        <w:rPr>
-          <w:rFonts w:eastAsia="Times New Roman" w:cs="Times New Roman" w:ascii="Times New Roman" w:hAnsi="Times New Roman"/>
-          <w:sz w:val="24"/>
-          <w:szCs w:val="24"/>
-          <w:u w:val="single"/>
-        </w:rPr>
-        <w:t>data science experience</w:t>
-      </w:r>
-      <w:r>
-        <w:rPr>
-          <w:rFonts w:eastAsia="Times New Roman" w:cs="Times New Roman" w:ascii="Times New Roman" w:hAnsi="Times New Roman"/>
-          <w:sz w:val="24"/>
-          <w:szCs w:val="24"/>
-        </w:rPr>
-        <w:t xml:space="preserve">. As a student who is doing his major in Computer Science, I have undertaken lots of projects that taught me how to be a team player who constantly thrive on improving the project or the task at hand. I learned how to work in a team and handle large amount of codebase; be it contributing to an existing code, refactoring the code, using trackers to keep records of issues and manage them. As part of my Master’s credits, I have also gained experience in fields like </w:t>
-      </w:r>
-      <w:r>
-        <w:rPr>
-          <w:rFonts w:eastAsia="Times New Roman" w:cs="Times New Roman" w:ascii="Times New Roman" w:hAnsi="Times New Roman"/>
-          <w:sz w:val="24"/>
-          <w:szCs w:val="24"/>
-          <w:u w:val="single"/>
-        </w:rPr>
-        <w:t>Ontology</w:t>
-      </w:r>
-      <w:r>
-        <w:rPr>
-          <w:rFonts w:eastAsia="Times New Roman" w:cs="Times New Roman" w:ascii="Times New Roman" w:hAnsi="Times New Roman"/>
-          <w:sz w:val="24"/>
-          <w:szCs w:val="24"/>
-        </w:rPr>
-        <w:t xml:space="preserve">, </w:t>
-      </w:r>
-      <w:r>
-        <w:rPr>
-          <w:rFonts w:eastAsia="Times New Roman" w:cs="Times New Roman" w:ascii="Times New Roman" w:hAnsi="Times New Roman"/>
-          <w:sz w:val="24"/>
-          <w:szCs w:val="24"/>
-          <w:u w:val="single"/>
-        </w:rPr>
-        <w:t>Web 3.0</w:t>
-      </w:r>
-      <w:r>
-        <w:rPr>
-          <w:rFonts w:eastAsia="Times New Roman" w:cs="Times New Roman" w:ascii="Times New Roman" w:hAnsi="Times New Roman"/>
-          <w:sz w:val="24"/>
-          <w:szCs w:val="24"/>
-        </w:rPr>
-        <w:t xml:space="preserve">, Sociology and </w:t>
-      </w:r>
-      <w:r>
-        <w:rPr>
-          <w:rFonts w:eastAsia="Times New Roman" w:cs="Times New Roman" w:ascii="Times New Roman" w:hAnsi="Times New Roman"/>
-          <w:sz w:val="24"/>
-          <w:szCs w:val="24"/>
-          <w:u w:val="single"/>
-        </w:rPr>
-        <w:t>Confluence of Humanities and Computer Science</w:t>
-      </w:r>
-      <w:r>
-        <w:rPr>
-          <w:rFonts w:eastAsia="Times New Roman" w:cs="Times New Roman" w:ascii="Times New Roman" w:hAnsi="Times New Roman"/>
-          <w:sz w:val="24"/>
-          <w:szCs w:val="24"/>
-        </w:rPr>
-        <w:t>.</w:t>
-      </w:r>
-    </w:p>
-    <w:p>
-      <w:pPr>
-        <w:pStyle w:val="Normal"/>
-        <w:spacing w:before="0" w:after="0"/>
-        <w:jc w:val="both"/>
-        <w:rPr>
-          <w:rFonts w:ascii="Times New Roman" w:hAnsi="Times New Roman" w:eastAsia="Times New Roman" w:cs="Times New Roman"/>
-          <w:sz w:val="24"/>
-          <w:szCs w:val="24"/>
-        </w:rPr>
-      </w:pPr>
-      <w:r>
-        <w:rPr>
-          <w:rFonts w:eastAsia="Times New Roman" w:cs="Times New Roman" w:ascii="Times New Roman" w:hAnsi="Times New Roman"/>
-          <w:sz w:val="24"/>
-          <w:szCs w:val="24"/>
-        </w:rPr>
-      </w:r>
-    </w:p>
-    <w:p>
-      <w:pPr>
-        <w:pStyle w:val="Normal"/>
-        <w:spacing w:before="0" w:after="0"/>
-        <w:jc w:val="both"/>
-        <w:rPr>
-          <w:rFonts w:ascii="Times New Roman" w:hAnsi="Times New Roman" w:eastAsia="Times New Roman" w:cs="Times New Roman"/>
-          <w:sz w:val="24"/>
-          <w:szCs w:val="24"/>
-        </w:rPr>
-      </w:pPr>
-      <w:r>
-        <w:rPr>
-          <w:rFonts w:eastAsia="Times New Roman" w:cs="Times New Roman" w:ascii="Times New Roman" w:hAnsi="Times New Roman"/>
-          <w:sz w:val="24"/>
-          <w:szCs w:val="24"/>
-        </w:rPr>
-        <w:t xml:space="preserve">The diversity in different fields that can be explored as a software developer inspires me to pursue it as a career option. In the past three years I have gathered a decent amount of exposure and proficient experience in projects dealing with </w:t>
-      </w:r>
-      <w:r>
-        <w:rPr>
-          <w:rFonts w:eastAsia="Times New Roman" w:cs="Times New Roman" w:ascii="Times New Roman" w:hAnsi="Times New Roman"/>
-          <w:sz w:val="24"/>
-          <w:szCs w:val="24"/>
-          <w:u w:val="single"/>
-        </w:rPr>
-        <w:t>Python, R, C/C++, HTML/CSS, Bash and JavaScript</w:t>
-      </w:r>
-      <w:r>
-        <w:rPr>
-          <w:rFonts w:eastAsia="Times New Roman" w:cs="Times New Roman" w:ascii="Times New Roman" w:hAnsi="Times New Roman"/>
-          <w:sz w:val="24"/>
-          <w:szCs w:val="24"/>
-        </w:rPr>
-        <w:t xml:space="preserve">. Along with my courses, I was appointed as a </w:t>
-      </w:r>
-      <w:r>
-        <w:rPr>
-          <w:rFonts w:eastAsia="Times New Roman" w:cs="Times New Roman" w:ascii="Times New Roman" w:hAnsi="Times New Roman"/>
-          <w:sz w:val="24"/>
-          <w:szCs w:val="24"/>
-          <w:u w:val="single"/>
-        </w:rPr>
-        <w:t>Teaching Assistant</w:t>
-      </w:r>
-      <w:r>
-        <w:rPr>
-          <w:rFonts w:eastAsia="Times New Roman" w:cs="Times New Roman" w:ascii="Times New Roman" w:hAnsi="Times New Roman"/>
-          <w:sz w:val="24"/>
-          <w:szCs w:val="24"/>
-        </w:rPr>
-        <w:t xml:space="preserve"> for IT Workshop 1 and 2 offered to undergraduate students, consecutively for two semesters. I took up course on Natural Language Processing to hone my skills and strengthen my foundations in the area of my research field. I thoroughly enjoyed the course which helped me gain a good introduction to Sentiment Analysis. Along with my academics, I have also interned at the prestigious </w:t>
-      </w:r>
-      <w:r>
-        <w:rPr>
-          <w:rFonts w:eastAsia="Times New Roman" w:cs="Times New Roman" w:ascii="Times New Roman" w:hAnsi="Times New Roman"/>
-          <w:sz w:val="24"/>
-          <w:szCs w:val="24"/>
-          <w:u w:val="single"/>
-        </w:rPr>
-        <w:t>Indian School of Business</w:t>
-      </w:r>
-      <w:r>
-        <w:rPr>
-          <w:rFonts w:eastAsia="Times New Roman" w:cs="Times New Roman" w:ascii="Times New Roman" w:hAnsi="Times New Roman"/>
-          <w:sz w:val="24"/>
-          <w:szCs w:val="24"/>
-        </w:rPr>
-        <w:t xml:space="preserve"> and startups focussing on cyber security, Authbase and data analytics, Lumata Digital.</w:t>
-      </w:r>
-    </w:p>
-    <w:p>
-      <w:pPr>
-        <w:pStyle w:val="Normal"/>
-        <w:spacing w:before="0" w:after="0"/>
-        <w:jc w:val="both"/>
-        <w:rPr>
-          <w:rFonts w:ascii="Times New Roman" w:hAnsi="Times New Roman" w:eastAsia="Times New Roman" w:cs="Times New Roman"/>
-          <w:sz w:val="24"/>
-          <w:szCs w:val="24"/>
-        </w:rPr>
-      </w:pPr>
-      <w:r>
-        <w:rPr>
-          <w:rFonts w:eastAsia="Times New Roman" w:cs="Times New Roman" w:ascii="Times New Roman" w:hAnsi="Times New Roman"/>
-          <w:sz w:val="24"/>
-          <w:szCs w:val="24"/>
-        </w:rPr>
-      </w:r>
-    </w:p>
-    <w:p>
-      <w:pPr>
-        <w:pStyle w:val="Normal"/>
-        <w:spacing w:before="0" w:after="0"/>
+        <w:contextualSpacing/>
         <w:jc w:val="both"/>
         <w:rPr/>
       </w:pPr>
-      <w:r>
-        <w:rPr>
-          <w:rFonts w:eastAsia="Times New Roman" w:cs="Times New Roman" w:ascii="Times New Roman" w:hAnsi="Times New Roman"/>
-          <w:sz w:val="24"/>
-          <w:szCs w:val="24"/>
-        </w:rPr>
-        <w:t>I am confident that my aptitude and relevant background would bring a high level of energy and enthusiasm to your program.</w:t>
+      <w:bookmarkStart w:id="0" w:name="__DdeLink__57_1644422661"/>
+      <w:r>
+        <w:rPr>
+          <w:rFonts w:eastAsia="Times New Roman" w:cs="Times New Roman" w:ascii="Times New Roman" w:hAnsi="Times New Roman"/>
+          <w:sz w:val="24"/>
+          <w:szCs w:val="24"/>
+        </w:rPr>
+        <w:t xml:space="preserve">I’m a pre-final year student at </w:t>
+      </w:r>
+      <w:r>
+        <w:rPr>
+          <w:rFonts w:eastAsia="Times New Roman" w:cs="Times New Roman" w:ascii="Times New Roman" w:hAnsi="Times New Roman"/>
+          <w:b/>
+          <w:sz w:val="24"/>
+          <w:szCs w:val="24"/>
+        </w:rPr>
+        <w:t>International Institute of Information Technology, Hyderabad</w:t>
+      </w:r>
+      <w:r>
+        <w:rPr>
+          <w:rFonts w:eastAsia="Times New Roman" w:cs="Times New Roman" w:ascii="Times New Roman" w:hAnsi="Times New Roman"/>
+          <w:sz w:val="24"/>
+          <w:szCs w:val="24"/>
+        </w:rPr>
+        <w:t xml:space="preserve">. I’m pursuing my </w:t>
+      </w:r>
+      <w:r>
+        <w:rPr>
+          <w:rFonts w:eastAsia="Times New Roman" w:cs="Times New Roman" w:ascii="Times New Roman" w:hAnsi="Times New Roman"/>
+          <w:b/>
+          <w:sz w:val="24"/>
+          <w:szCs w:val="24"/>
+        </w:rPr>
+        <w:t xml:space="preserve">B.Tech </w:t>
+      </w:r>
+      <w:r>
+        <w:rPr>
+          <w:rFonts w:eastAsia="Times New Roman" w:cs="Times New Roman" w:ascii="Times New Roman" w:hAnsi="Times New Roman"/>
+          <w:b/>
+          <w:sz w:val="24"/>
+          <w:szCs w:val="24"/>
+        </w:rPr>
+        <w:t>(Hons)</w:t>
+      </w:r>
+      <w:r>
+        <w:rPr>
+          <w:rFonts w:eastAsia="Times New Roman" w:cs="Times New Roman" w:ascii="Times New Roman" w:hAnsi="Times New Roman"/>
+          <w:b/>
+          <w:sz w:val="24"/>
+          <w:szCs w:val="24"/>
+        </w:rPr>
+        <w:t xml:space="preserve"> in Computer Science</w:t>
+      </w:r>
+      <w:r>
+        <w:rPr>
+          <w:rFonts w:eastAsia="Times New Roman" w:cs="Times New Roman" w:ascii="Times New Roman" w:hAnsi="Times New Roman"/>
+          <w:sz w:val="24"/>
+          <w:szCs w:val="24"/>
+        </w:rPr>
+        <w:t xml:space="preserve"> and </w:t>
+      </w:r>
+      <w:r>
+        <w:rPr>
+          <w:rFonts w:eastAsia="Times New Roman" w:cs="Times New Roman" w:ascii="Times New Roman" w:hAnsi="Times New Roman"/>
+          <w:b/>
+          <w:sz w:val="24"/>
+          <w:szCs w:val="24"/>
+        </w:rPr>
+        <w:t xml:space="preserve">MS by Research in </w:t>
+      </w:r>
+      <w:r>
+        <w:rPr>
+          <w:rFonts w:eastAsia="Times New Roman" w:cs="Times New Roman" w:ascii="Times New Roman" w:hAnsi="Times New Roman"/>
+          <w:b/>
+          <w:sz w:val="24"/>
+          <w:szCs w:val="24"/>
+        </w:rPr>
+        <w:t>Computational</w:t>
+      </w:r>
+      <w:r>
+        <w:rPr>
+          <w:rFonts w:eastAsia="Times New Roman" w:cs="Times New Roman" w:ascii="Times New Roman" w:hAnsi="Times New Roman"/>
+          <w:b/>
+          <w:sz w:val="24"/>
+          <w:szCs w:val="24"/>
+        </w:rPr>
+        <w:t xml:space="preserve"> Humanities</w:t>
+      </w:r>
+      <w:r>
+        <w:rPr>
+          <w:rFonts w:eastAsia="Times New Roman" w:cs="Times New Roman" w:ascii="Times New Roman" w:hAnsi="Times New Roman"/>
+          <w:sz w:val="24"/>
+          <w:szCs w:val="24"/>
+        </w:rPr>
+        <w:t xml:space="preserve">. My primary interests lies in the field of </w:t>
+      </w:r>
+      <w:r>
+        <w:rPr>
+          <w:rFonts w:eastAsia="Times New Roman" w:cs="Times New Roman" w:ascii="Times New Roman" w:hAnsi="Times New Roman"/>
+          <w:sz w:val="24"/>
+          <w:szCs w:val="24"/>
+          <w:u w:val="single"/>
+        </w:rPr>
+        <w:t>Software Development, Data Science and Machine Learning</w:t>
+      </w:r>
+      <w:r>
+        <w:rPr>
+          <w:rFonts w:eastAsia="Times New Roman" w:cs="Times New Roman" w:ascii="Times New Roman" w:hAnsi="Times New Roman"/>
+          <w:sz w:val="24"/>
+          <w:szCs w:val="24"/>
+        </w:rPr>
+        <w:t>.</w:t>
       </w:r>
     </w:p>
     <w:p>
       <w:pPr>
         <w:pStyle w:val="Normal"/>
         <w:spacing w:before="0" w:after="0"/>
+        <w:contextualSpacing/>
+        <w:jc w:val="both"/>
+        <w:rPr>
+          <w:rFonts w:ascii="Times New Roman" w:hAnsi="Times New Roman" w:eastAsia="Times New Roman" w:cs="Times New Roman"/>
+          <w:sz w:val="24"/>
+          <w:szCs w:val="24"/>
+        </w:rPr>
+      </w:pPr>
+      <w:r>
+        <w:rPr>
+          <w:rFonts w:eastAsia="Times New Roman" w:cs="Times New Roman" w:ascii="Times New Roman" w:hAnsi="Times New Roman"/>
+          <w:sz w:val="24"/>
+          <w:szCs w:val="24"/>
+        </w:rPr>
+      </w:r>
+    </w:p>
+    <w:p>
+      <w:pPr>
+        <w:pStyle w:val="Normal"/>
+        <w:spacing w:before="0" w:after="0"/>
+        <w:contextualSpacing/>
+        <w:jc w:val="both"/>
+        <w:rPr>
+          <w:rFonts w:ascii="Times New Roman" w:hAnsi="Times New Roman" w:eastAsia="Times New Roman" w:cs="Times New Roman"/>
+          <w:sz w:val="24"/>
+          <w:szCs w:val="24"/>
+        </w:rPr>
+      </w:pPr>
+      <w:r>
+        <w:rPr>
+          <w:rFonts w:eastAsia="Times New Roman" w:cs="Times New Roman" w:ascii="Times New Roman" w:hAnsi="Times New Roman"/>
+          <w:sz w:val="24"/>
+          <w:szCs w:val="24"/>
+        </w:rPr>
+        <w:t xml:space="preserve">I am a fast learner, a passionate developing enthusiast and I love solving problems; be it tinkering with designing a model or simply developing programs and breaking the code. I have a good amount of </w:t>
+      </w:r>
+      <w:r>
+        <w:rPr>
+          <w:rFonts w:eastAsia="Times New Roman" w:cs="Times New Roman" w:ascii="Times New Roman" w:hAnsi="Times New Roman"/>
+          <w:sz w:val="24"/>
+          <w:szCs w:val="24"/>
+          <w:u w:val="single"/>
+        </w:rPr>
+        <w:t>full stack development</w:t>
+      </w:r>
+      <w:r>
+        <w:rPr>
+          <w:rFonts w:eastAsia="Times New Roman" w:cs="Times New Roman" w:ascii="Times New Roman" w:hAnsi="Times New Roman"/>
+          <w:sz w:val="24"/>
+          <w:szCs w:val="24"/>
+        </w:rPr>
+        <w:t xml:space="preserve"> and </w:t>
+      </w:r>
+      <w:r>
+        <w:rPr>
+          <w:rFonts w:eastAsia="Times New Roman" w:cs="Times New Roman" w:ascii="Times New Roman" w:hAnsi="Times New Roman"/>
+          <w:sz w:val="24"/>
+          <w:szCs w:val="24"/>
+          <w:u w:val="single"/>
+        </w:rPr>
+        <w:t>data science experience</w:t>
+      </w:r>
+      <w:r>
+        <w:rPr>
+          <w:rFonts w:eastAsia="Times New Roman" w:cs="Times New Roman" w:ascii="Times New Roman" w:hAnsi="Times New Roman"/>
+          <w:sz w:val="24"/>
+          <w:szCs w:val="24"/>
+        </w:rPr>
+        <w:t xml:space="preserve">. As a student who is doing his major in Computer Science, I have undertaken lots of projects that taught me how to be a team player who constantly thrive on improving the project or the task at hand. I learned how to work in a team and handle large amount of codebase; be it contributing to an existing code, refactoring the code, using trackers to keep records of issues and manage them. As part of my Master’s credits, I have also gained experience in fields like </w:t>
+      </w:r>
+      <w:r>
+        <w:rPr>
+          <w:rFonts w:eastAsia="Times New Roman" w:cs="Times New Roman" w:ascii="Times New Roman" w:hAnsi="Times New Roman"/>
+          <w:sz w:val="24"/>
+          <w:szCs w:val="24"/>
+          <w:u w:val="single"/>
+        </w:rPr>
+        <w:t>Ontology</w:t>
+      </w:r>
+      <w:r>
+        <w:rPr>
+          <w:rFonts w:eastAsia="Times New Roman" w:cs="Times New Roman" w:ascii="Times New Roman" w:hAnsi="Times New Roman"/>
+          <w:sz w:val="24"/>
+          <w:szCs w:val="24"/>
+        </w:rPr>
+        <w:t xml:space="preserve">, </w:t>
+      </w:r>
+      <w:r>
+        <w:rPr>
+          <w:rFonts w:eastAsia="Times New Roman" w:cs="Times New Roman" w:ascii="Times New Roman" w:hAnsi="Times New Roman"/>
+          <w:sz w:val="24"/>
+          <w:szCs w:val="24"/>
+          <w:u w:val="single"/>
+        </w:rPr>
+        <w:t>Web 3.0</w:t>
+      </w:r>
+      <w:r>
+        <w:rPr>
+          <w:rFonts w:eastAsia="Times New Roman" w:cs="Times New Roman" w:ascii="Times New Roman" w:hAnsi="Times New Roman"/>
+          <w:sz w:val="24"/>
+          <w:szCs w:val="24"/>
+        </w:rPr>
+        <w:t xml:space="preserve">, Sociology and </w:t>
+      </w:r>
+      <w:r>
+        <w:rPr>
+          <w:rFonts w:eastAsia="Times New Roman" w:cs="Times New Roman" w:ascii="Times New Roman" w:hAnsi="Times New Roman"/>
+          <w:sz w:val="24"/>
+          <w:szCs w:val="24"/>
+          <w:u w:val="single"/>
+        </w:rPr>
+        <w:t>Confluence of Humanities and Computer Science</w:t>
+      </w:r>
+      <w:r>
+        <w:rPr>
+          <w:rFonts w:eastAsia="Times New Roman" w:cs="Times New Roman" w:ascii="Times New Roman" w:hAnsi="Times New Roman"/>
+          <w:sz w:val="24"/>
+          <w:szCs w:val="24"/>
+        </w:rPr>
+        <w:t>.</w:t>
+      </w:r>
+    </w:p>
+    <w:p>
+      <w:pPr>
+        <w:pStyle w:val="Normal"/>
+        <w:spacing w:before="0" w:after="0"/>
+        <w:contextualSpacing/>
+        <w:jc w:val="both"/>
+        <w:rPr>
+          <w:rFonts w:ascii="Times New Roman" w:hAnsi="Times New Roman" w:eastAsia="Times New Roman" w:cs="Times New Roman"/>
+          <w:sz w:val="24"/>
+          <w:szCs w:val="24"/>
+        </w:rPr>
+      </w:pPr>
+      <w:r>
+        <w:rPr>
+          <w:rFonts w:eastAsia="Times New Roman" w:cs="Times New Roman" w:ascii="Times New Roman" w:hAnsi="Times New Roman"/>
+          <w:sz w:val="24"/>
+          <w:szCs w:val="24"/>
+        </w:rPr>
+      </w:r>
+    </w:p>
+    <w:p>
+      <w:pPr>
+        <w:pStyle w:val="Normal"/>
+        <w:spacing w:before="0" w:after="0"/>
+        <w:contextualSpacing/>
+        <w:jc w:val="both"/>
+        <w:rPr>
+          <w:rFonts w:ascii="Times New Roman" w:hAnsi="Times New Roman" w:eastAsia="Times New Roman" w:cs="Times New Roman"/>
+          <w:sz w:val="24"/>
+          <w:szCs w:val="24"/>
+        </w:rPr>
+      </w:pPr>
+      <w:r>
+        <w:rPr>
+          <w:rFonts w:eastAsia="Times New Roman" w:cs="Times New Roman" w:ascii="Times New Roman" w:hAnsi="Times New Roman"/>
+          <w:sz w:val="24"/>
+          <w:szCs w:val="24"/>
+        </w:rPr>
+        <w:t xml:space="preserve">The diversity in different fields that can be explored as a software developer inspires me to pursue it as a career option. In the past three years I have gathered a decent amount of exposure and proficient experience in projects dealing with </w:t>
+      </w:r>
+      <w:r>
+        <w:rPr>
+          <w:rFonts w:eastAsia="Times New Roman" w:cs="Times New Roman" w:ascii="Times New Roman" w:hAnsi="Times New Roman"/>
+          <w:sz w:val="24"/>
+          <w:szCs w:val="24"/>
+          <w:u w:val="single"/>
+        </w:rPr>
+        <w:t>Python, R, C/C++, HTML/CSS, Bash and JavaScript</w:t>
+      </w:r>
+      <w:r>
+        <w:rPr>
+          <w:rFonts w:eastAsia="Times New Roman" w:cs="Times New Roman" w:ascii="Times New Roman" w:hAnsi="Times New Roman"/>
+          <w:sz w:val="24"/>
+          <w:szCs w:val="24"/>
+        </w:rPr>
+        <w:t xml:space="preserve">. Along with my courses, I was appointed as a </w:t>
+      </w:r>
+      <w:r>
+        <w:rPr>
+          <w:rFonts w:eastAsia="Times New Roman" w:cs="Times New Roman" w:ascii="Times New Roman" w:hAnsi="Times New Roman"/>
+          <w:sz w:val="24"/>
+          <w:szCs w:val="24"/>
+          <w:u w:val="single"/>
+        </w:rPr>
+        <w:t>Teaching Assistant</w:t>
+      </w:r>
+      <w:r>
+        <w:rPr>
+          <w:rFonts w:eastAsia="Times New Roman" w:cs="Times New Roman" w:ascii="Times New Roman" w:hAnsi="Times New Roman"/>
+          <w:sz w:val="24"/>
+          <w:szCs w:val="24"/>
+        </w:rPr>
+        <w:t xml:space="preserve"> for IT Workshop 1 and 2 offered to undergraduate students, consecutively for two semesters. I took up course on Natural Language Processing to hone my skills and strengthen my foundations in the area of my research field. I thoroughly enjoyed the course which helped me gain a good introduction to Sentiment Analysis. Along with my academics, I have also interned at the prestigious </w:t>
+      </w:r>
+      <w:r>
+        <w:rPr>
+          <w:rFonts w:eastAsia="Times New Roman" w:cs="Times New Roman" w:ascii="Times New Roman" w:hAnsi="Times New Roman"/>
+          <w:sz w:val="24"/>
+          <w:szCs w:val="24"/>
+          <w:u w:val="single"/>
+        </w:rPr>
+        <w:t>Indian School of Business</w:t>
+      </w:r>
+      <w:r>
+        <w:rPr>
+          <w:rFonts w:eastAsia="Times New Roman" w:cs="Times New Roman" w:ascii="Times New Roman" w:hAnsi="Times New Roman"/>
+          <w:sz w:val="24"/>
+          <w:szCs w:val="24"/>
+        </w:rPr>
+        <w:t xml:space="preserve"> and startups focussing on cyber security, Authbase and data analytics, Lumata Digital.</w:t>
+      </w:r>
+    </w:p>
+    <w:p>
+      <w:pPr>
+        <w:pStyle w:val="Normal"/>
+        <w:spacing w:before="0" w:after="0"/>
+        <w:contextualSpacing/>
+        <w:jc w:val="both"/>
+        <w:rPr>
+          <w:rFonts w:ascii="Times New Roman" w:hAnsi="Times New Roman" w:eastAsia="Times New Roman" w:cs="Times New Roman"/>
+          <w:sz w:val="24"/>
+          <w:szCs w:val="24"/>
+        </w:rPr>
+      </w:pPr>
+      <w:r>
+        <w:rPr>
+          <w:rFonts w:eastAsia="Times New Roman" w:cs="Times New Roman" w:ascii="Times New Roman" w:hAnsi="Times New Roman"/>
+          <w:sz w:val="24"/>
+          <w:szCs w:val="24"/>
+        </w:rPr>
+      </w:r>
+    </w:p>
+    <w:p>
+      <w:pPr>
+        <w:pStyle w:val="Normal"/>
+        <w:spacing w:before="0" w:after="0"/>
+        <w:contextualSpacing/>
         <w:jc w:val="both"/>
         <w:rPr/>
       </w:pPr>
+      <w:bookmarkStart w:id="1" w:name="__DdeLink__57_1644422661"/>
+      <w:bookmarkEnd w:id="1"/>
+      <w:r>
+        <w:rPr>
+          <w:rFonts w:eastAsia="Times New Roman" w:cs="Times New Roman" w:ascii="Times New Roman" w:hAnsi="Times New Roman"/>
+          <w:sz w:val="24"/>
+          <w:szCs w:val="24"/>
+        </w:rPr>
+        <w:t>I am confident that my aptitude and relevant background would bring a high level of energy and enthusiasm to your program.</w:t>
+      </w:r>
+    </w:p>
+    <w:p>
+      <w:pPr>
+        <w:pStyle w:val="Normal"/>
+        <w:spacing w:before="0" w:after="0"/>
+        <w:contextualSpacing/>
+        <w:jc w:val="both"/>
+        <w:rPr/>
+      </w:pPr>
       <w:r>
         <w:rPr>
           <w:rFonts w:eastAsia="Times New Roman" w:cs="Times New Roman" w:ascii="Times New Roman" w:hAnsi="Times New Roman"/>
@@ -568,6 +618,7 @@
       <w:pPr>
         <w:pStyle w:val="Normal"/>
         <w:spacing w:lineRule="auto" w:line="240" w:before="0" w:after="0"/>
+        <w:contextualSpacing/>
         <w:jc w:val="both"/>
         <w:rPr>
           <w:rFonts w:ascii="Times New Roman" w:hAnsi="Times New Roman" w:eastAsia="Times New Roman" w:cs="Times New Roman"/>
@@ -591,6 +642,7 @@
       <w:pPr>
         <w:pStyle w:val="Normal"/>
         <w:spacing w:lineRule="auto" w:line="240" w:before="0" w:after="0"/>
+        <w:contextualSpacing/>
         <w:jc w:val="both"/>
         <w:rPr>
           <w:rFonts w:ascii="Times New Roman" w:hAnsi="Times New Roman" w:eastAsia="Times New Roman" w:cs="Times New Roman"/>
@@ -612,6 +664,7 @@
       <w:pPr>
         <w:pStyle w:val="Normal"/>
         <w:spacing w:lineRule="auto" w:line="240" w:before="0" w:after="0"/>
+        <w:contextualSpacing/>
         <w:jc w:val="both"/>
         <w:rPr>
           <w:rFonts w:ascii="Times New Roman" w:hAnsi="Times New Roman" w:eastAsia="Times New Roman" w:cs="Times New Roman"/>
@@ -634,6 +687,7 @@
       <w:pPr>
         <w:pStyle w:val="Normal"/>
         <w:spacing w:lineRule="auto" w:line="240" w:before="0" w:after="0"/>
+        <w:contextualSpacing/>
         <w:jc w:val="both"/>
         <w:rPr>
           <w:rFonts w:ascii="Times New Roman" w:hAnsi="Times New Roman" w:eastAsia="Times New Roman" w:cs="Times New Roman"/>
@@ -656,6 +710,7 @@
       <w:pPr>
         <w:pStyle w:val="Normal"/>
         <w:spacing w:lineRule="auto" w:line="240" w:before="0" w:after="0"/>
+        <w:contextualSpacing/>
         <w:jc w:val="both"/>
         <w:rPr>
           <w:rFonts w:ascii="Times New Roman" w:hAnsi="Times New Roman" w:eastAsia="Times New Roman" w:cs="Times New Roman"/>
@@ -677,6 +732,7 @@
       <w:pPr>
         <w:pStyle w:val="Normal"/>
         <w:spacing w:before="0" w:after="0"/>
+        <w:contextualSpacing/>
         <w:rPr/>
       </w:pPr>
       <w:r>
@@ -687,6 +743,7 @@
       <w:pPr>
         <w:pStyle w:val="Normal"/>
         <w:spacing w:before="0" w:after="0"/>
+        <w:contextualSpacing/>
         <w:rPr/>
       </w:pPr>
       <w:r>
@@ -700,7 +757,7 @@
       <w:pgNumType w:start="1" w:fmt="decimal"/>
       <w:formProt w:val="false"/>
       <w:textDirection w:val="lrTb"/>
-      <w:docGrid w:type="default" w:linePitch="100" w:charSpace="4096"/>
+      <w:docGrid w:type="default" w:linePitch="260" w:charSpace="4294965247"/>
     </w:sectPr>
   </w:body>
 </w:document>
@@ -712,7 +769,6 @@
     <w:rPrDefault>
       <w:rPr>
         <w:rFonts w:ascii="Arial" w:hAnsi="Arial" w:eastAsia="Arial" w:cs="Arial"/>
-        <w:sz w:val="22"/>
         <w:szCs w:val="22"/>
         <w:lang w:val="en" w:eastAsia="zh-CN" w:bidi="hi-IN"/>
       </w:rPr>
@@ -726,13 +782,14 @@
     <w:qFormat/>
     <w:pPr>
       <w:widowControl w:val="false"/>
+      <w:bidi w:val="0"/>
       <w:spacing w:lineRule="auto" w:line="276" w:before="0" w:after="0"/>
       <w:contextualSpacing/>
+      <w:jc w:val="left"/>
     </w:pPr>
     <w:rPr>
       <w:rFonts w:ascii="Arial" w:hAnsi="Arial" w:eastAsia="Arial" w:cs="Arial"/>
-      <w:color w:val="auto"/>
-      <w:kern w:val="0"/>
+      <w:color w:val="00000A"/>
       <w:sz w:val="22"/>
       <w:szCs w:val="22"/>
       <w:lang w:val="en" w:eastAsia="zh-CN" w:bidi="hi-IN"/>
@@ -740,99 +797,113 @@
   </w:style>
   <w:style w:type="paragraph" w:styleId="Heading1">
     <w:name w:val="Heading 1"/>
-    <w:basedOn w:val="Normal1"/>
     <w:next w:val="Normal"/>
     <w:qFormat/>
     <w:pPr>
-      <w:keepNext w:val="true"/>
+      <w:keepNext/>
       <w:keepLines/>
+      <w:widowControl w:val="false"/>
       <w:spacing w:lineRule="auto" w:line="240" w:before="400" w:after="120"/>
     </w:pPr>
     <w:rPr>
+      <w:rFonts w:ascii="Arial" w:hAnsi="Arial" w:eastAsia="Arial" w:cs="Arial"/>
+      <w:color w:val="auto"/>
       <w:sz w:val="40"/>
       <w:szCs w:val="40"/>
+      <w:lang w:val="en" w:eastAsia="zh-CN" w:bidi="hi-IN"/>
     </w:rPr>
   </w:style>
   <w:style w:type="paragraph" w:styleId="Heading2">
     <w:name w:val="Heading 2"/>
-    <w:basedOn w:val="Normal1"/>
     <w:next w:val="Normal"/>
     <w:qFormat/>
     <w:pPr>
-      <w:keepNext w:val="true"/>
+      <w:keepNext/>
       <w:keepLines/>
+      <w:widowControl w:val="false"/>
       <w:spacing w:lineRule="auto" w:line="240" w:before="360" w:after="120"/>
     </w:pPr>
     <w:rPr>
+      <w:rFonts w:ascii="Arial" w:hAnsi="Arial" w:eastAsia="Arial" w:cs="Arial"/>
       <w:b w:val="false"/>
+      <w:color w:val="auto"/>
       <w:sz w:val="32"/>
       <w:szCs w:val="32"/>
+      <w:lang w:val="en" w:eastAsia="zh-CN" w:bidi="hi-IN"/>
     </w:rPr>
   </w:style>
   <w:style w:type="paragraph" w:styleId="Heading3">
     <w:name w:val="Heading 3"/>
-    <w:basedOn w:val="Normal1"/>
     <w:next w:val="Normal"/>
     <w:qFormat/>
     <w:pPr>
-      <w:keepNext w:val="true"/>
+      <w:keepNext/>
       <w:keepLines/>
+      <w:widowControl w:val="false"/>
       <w:spacing w:lineRule="auto" w:line="240" w:before="320" w:after="80"/>
     </w:pPr>
     <w:rPr>
+      <w:rFonts w:ascii="Arial" w:hAnsi="Arial" w:eastAsia="Arial" w:cs="Arial"/>
       <w:b w:val="false"/>
       <w:color w:val="434343"/>
       <w:sz w:val="28"/>
       <w:szCs w:val="28"/>
+      <w:lang w:val="en" w:eastAsia="zh-CN" w:bidi="hi-IN"/>
     </w:rPr>
   </w:style>
   <w:style w:type="paragraph" w:styleId="Heading4">
     <w:name w:val="Heading 4"/>
-    <w:basedOn w:val="Normal1"/>
     <w:next w:val="Normal"/>
     <w:qFormat/>
     <w:pPr>
-      <w:keepNext w:val="true"/>
+      <w:keepNext/>
       <w:keepLines/>
+      <w:widowControl w:val="false"/>
       <w:spacing w:lineRule="auto" w:line="240" w:before="280" w:after="80"/>
     </w:pPr>
     <w:rPr>
+      <w:rFonts w:ascii="Arial" w:hAnsi="Arial" w:eastAsia="Arial" w:cs="Arial"/>
       <w:color w:val="666666"/>
       <w:sz w:val="24"/>
       <w:szCs w:val="24"/>
+      <w:lang w:val="en" w:eastAsia="zh-CN" w:bidi="hi-IN"/>
     </w:rPr>
   </w:style>
   <w:style w:type="paragraph" w:styleId="Heading5">
     <w:name w:val="Heading 5"/>
-    <w:basedOn w:val="Normal1"/>
     <w:next w:val="Normal"/>
     <w:qFormat/>
     <w:pPr>
-      <w:keepNext w:val="true"/>
+      <w:keepNext/>
       <w:keepLines/>
+      <w:widowControl w:val="false"/>
       <w:spacing w:lineRule="auto" w:line="240" w:before="240" w:after="80"/>
     </w:pPr>
     <w:rPr>
+      <w:rFonts w:ascii="Arial" w:hAnsi="Arial" w:eastAsia="Arial" w:cs="Arial"/>
       <w:color w:val="666666"/>
       <w:sz w:val="22"/>
       <w:szCs w:val="22"/>
+      <w:lang w:val="en" w:eastAsia="zh-CN" w:bidi="hi-IN"/>
     </w:rPr>
   </w:style>
   <w:style w:type="paragraph" w:styleId="Heading6">
     <w:name w:val="Heading 6"/>
-    <w:basedOn w:val="Normal1"/>
     <w:next w:val="Normal"/>
     <w:qFormat/>
     <w:pPr>
-      <w:keepNext w:val="true"/>
+      <w:keepNext/>
       <w:keepLines/>
+      <w:widowControl w:val="false"/>
       <w:spacing w:lineRule="auto" w:line="240" w:before="240" w:after="80"/>
     </w:pPr>
     <w:rPr>
+      <w:rFonts w:ascii="Arial" w:hAnsi="Arial" w:eastAsia="Arial" w:cs="Arial"/>
       <w:i/>
       <w:color w:val="666666"/>
       <w:sz w:val="22"/>
       <w:szCs w:val="22"/>
+      <w:lang w:val="en" w:eastAsia="zh-CN" w:bidi="hi-IN"/>
     </w:rPr>
   </w:style>
   <w:style w:type="character" w:styleId="ListLabel1">
@@ -860,8 +931,9 @@
     <w:next w:val="TextBody"/>
     <w:qFormat/>
     <w:pPr>
-      <w:keepNext w:val="true"/>
+      <w:keepNext/>
       <w:spacing w:before="240" w:after="120"/>
+      <w:contextualSpacing/>
     </w:pPr>
     <w:rPr>
       <w:rFonts w:ascii="Liberation Sans" w:hAnsi="Liberation Sans" w:eastAsia="Noto Sans CJK SC Regular" w:cs="Lohit Devanagari"/>
@@ -874,6 +946,7 @@
     <w:basedOn w:val="Normal"/>
     <w:pPr>
       <w:spacing w:lineRule="auto" w:line="276" w:before="0" w:after="140"/>
+      <w:contextualSpacing/>
     </w:pPr>
     <w:rPr/>
   </w:style>
@@ -892,6 +965,7 @@
     <w:pPr>
       <w:suppressLineNumbers/>
       <w:spacing w:before="120" w:after="120"/>
+      <w:contextualSpacing/>
     </w:pPr>
     <w:rPr>
       <w:rFonts w:cs="Lohit Devanagari"/>
@@ -912,7 +986,7 @@
       <w:rFonts w:cs="Lohit Devanagari"/>
     </w:rPr>
   </w:style>
-  <w:style w:type="paragraph" w:styleId="Normal1" w:default="1">
+  <w:style w:type="paragraph" w:styleId="LOnormal" w:default="1">
     <w:name w:val="LO-normal"/>
     <w:qFormat/>
     <w:pPr>
@@ -922,8 +996,7 @@
     </w:pPr>
     <w:rPr>
       <w:rFonts w:ascii="Arial" w:hAnsi="Arial" w:eastAsia="Arial" w:cs="Arial"/>
-      <w:color w:val="auto"/>
-      <w:kern w:val="0"/>
+      <w:color w:val="00000A"/>
       <w:sz w:val="22"/>
       <w:szCs w:val="22"/>
       <w:lang w:val="en" w:eastAsia="zh-CN" w:bidi="hi-IN"/>
@@ -931,11 +1004,11 @@
   </w:style>
   <w:style w:type="paragraph" w:styleId="Title">
     <w:name w:val="Title"/>
-    <w:basedOn w:val="Normal1"/>
+    <w:basedOn w:val="LOnormal"/>
     <w:next w:val="Normal"/>
     <w:qFormat/>
     <w:pPr>
-      <w:keepNext w:val="true"/>
+      <w:keepNext/>
       <w:keepLines/>
       <w:spacing w:lineRule="auto" w:line="240" w:before="0" w:after="60"/>
     </w:pPr>
@@ -946,11 +1019,11 @@
   </w:style>
   <w:style w:type="paragraph" w:styleId="Subtitle">
     <w:name w:val="Subtitle"/>
-    <w:basedOn w:val="Normal1"/>
+    <w:basedOn w:val="LOnormal"/>
     <w:next w:val="Normal"/>
     <w:qFormat/>
     <w:pPr>
-      <w:keepNext w:val="true"/>
+      <w:keepNext/>
       <w:keepLines/>
       <w:spacing w:lineRule="auto" w:line="240" w:before="0" w:after="320"/>
     </w:pPr>

</xml_diff>